<commit_message>
Arreglo critico: el contenido ya no se recorta en pantalla; respuestas del quiz en la guia
</commit_message>
<xml_diff>
--- a/Guia para exponer - Hinduismo.docx
+++ b/Guia para exponer - Hinduismo.docx
@@ -693,25 +693,228 @@
       </w:r>
     </w:p>
     <w:p>
+      <w:r>
+        <w:br w:type="page"/>
+      </w:r>
+    </w:p>
+    <w:p>
+      <w:pPr>
+        <w:pStyle w:val="Heading1"/>
+      </w:pPr>
+      <w:r>
+        <w:t xml:space="preserve">El quiz y sus respuestas</w:t>
+      </w:r>
+    </w:p>
+    <w:p>
+      <w:pPr>
+        <w:spacing w:after="160" w:line="300"/>
+        <w:jc w:val="both"/>
+      </w:pPr>
+      <w:r>
+        <w:rPr>
+          <w:sz w:val="22"/>
+          <w:szCs w:val="22"/>
+        </w:rPr>
+        <w:t xml:space="preserve">Después de la escena 12 viene la pantalla del quiz. Ahí solo hay que invitar al curso a sacar el celular, escanear el código QR y responder cinco preguntas. Se abre solo en el navegador, no hay que instalar nada ni tener cuenta de nada. Al terminar, cada uno ve su puntaje y la explicación de cada respuesta. Las cinco preguntas salen de las escenas 02, 03, 04, 07, 08 y 09.</w:t>
+      </w:r>
+    </w:p>
+    <w:p>
       <w:pPr>
         <w:pStyle w:val="Heading2"/>
       </w:pPr>
       <w:r>
-        <w:t xml:space="preserve">Pantalla final — el quiz</w:t>
-      </w:r>
-    </w:p>
-    <w:p>
-      <w:pPr>
-        <w:spacing w:after="160" w:line="300"/>
-        <w:jc w:val="both"/>
-      </w:pPr>
-      <w:r>
-        <w:rPr>
-          <w:sz w:val="22"/>
-          <w:szCs w:val="22"/>
-        </w:rPr>
-        <w:t xml:space="preserve">Después de la escena 12 viene la pantalla del quiz. Ahí solo hay que invitar al curso a sacar el celular, escanear el código QR y responder cinco preguntas. Se abre solo en el navegador, no hay que instalar nada ni tener cuenta de nada. Al terminar, cada uno ve su puntaje y la explicación de cada respuesta. Las cinco preguntas salen de las escenas 02, 03, 04, 07, 08 y 09.</w:t>
-      </w:r>
+        <w:t xml:space="preserve">Las 5 respuestas correctas</w:t>
+      </w:r>
+    </w:p>
+    <w:p>
+      <w:pPr>
+        <w:spacing w:after="40" w:before="140"/>
+      </w:pPr>
+      <w:r>
+        <w:rPr>
+          <w:b/>
+          <w:bCs/>
+          <w:sz w:val="22"/>
+          <w:szCs w:val="22"/>
+        </w:rPr>
+        <w:t xml:space="preserve">1. ¿De dónde viene realmente la palabra «hindú»?</w:t>
+      </w:r>
+    </w:p>
+    <w:p>
+      <w:pPr>
+        <w:spacing w:after="60"/>
+        <w:ind w:left="240"/>
+      </w:pPr>
+      <w:r>
+        <w:rPr>
+          <w:b/>
+          <w:bCs/>
+          <w:color w:val="9C4A1A"/>
+          <w:sz w:val="22"/>
+          <w:szCs w:val="22"/>
+        </w:rPr>
+        <w:t xml:space="preserve">Respuesta: </w:t>
+      </w:r>
+      <w:r>
+        <w:rPr>
+          <w:sz w:val="22"/>
+          <w:szCs w:val="22"/>
+        </w:rPr>
+        <w:t xml:space="preserve">Del nombre del río Sindhu (Indo): así llamaba la gente de fuera a quienes vivían al otro lado del río.</w:t>
+      </w:r>
+    </w:p>
+    <w:p>
+      <w:pPr>
+        <w:spacing w:after="40" w:before="140"/>
+      </w:pPr>
+      <w:r>
+        <w:rPr>
+          <w:b/>
+          <w:bCs/>
+          <w:sz w:val="22"/>
+          <w:szCs w:val="22"/>
+        </w:rPr>
+        <w:t xml:space="preserve">2. ¿Qué es exactamente moksha?</w:t>
+      </w:r>
+    </w:p>
+    <w:p>
+      <w:pPr>
+        <w:spacing w:after="60"/>
+        <w:ind w:left="240"/>
+      </w:pPr>
+      <w:r>
+        <w:rPr>
+          <w:b/>
+          <w:bCs/>
+          <w:color w:val="9C4A1A"/>
+          <w:sz w:val="22"/>
+          <w:szCs w:val="22"/>
+        </w:rPr>
+        <w:t xml:space="preserve">Respuesta: </w:t>
+      </w:r>
+      <w:r>
+        <w:rPr>
+          <w:sz w:val="22"/>
+          <w:szCs w:val="22"/>
+        </w:rPr>
+        <w:t xml:space="preserve">Salir para siempre del ciclo de nacer, morir y volver a nacer.</w:t>
+      </w:r>
+    </w:p>
+    <w:p>
+      <w:pPr>
+        <w:spacing w:after="40" w:before="140"/>
+      </w:pPr>
+      <w:r>
+        <w:rPr>
+          <w:b/>
+          <w:bCs/>
+          <w:sz w:val="22"/>
+          <w:szCs w:val="22"/>
+        </w:rPr>
+        <w:t xml:space="preserve">3. ¿Qué artículo abolió la intocabilidad y desde cuándo está en vigor?</w:t>
+      </w:r>
+    </w:p>
+    <w:p>
+      <w:pPr>
+        <w:spacing w:after="60"/>
+        <w:ind w:left="240"/>
+      </w:pPr>
+      <w:r>
+        <w:rPr>
+          <w:b/>
+          <w:bCs/>
+          <w:color w:val="9C4A1A"/>
+          <w:sz w:val="22"/>
+          <w:szCs w:val="22"/>
+        </w:rPr>
+        <w:t xml:space="preserve">Respuesta: </w:t>
+      </w:r>
+      <w:r>
+        <w:rPr>
+          <w:sz w:val="22"/>
+          <w:szCs w:val="22"/>
+        </w:rPr>
+        <w:t xml:space="preserve">El artículo 17, en vigor desde el 26 de enero de 1950.</w:t>
+      </w:r>
+    </w:p>
+    <w:p>
+      <w:pPr>
+        <w:spacing w:after="40" w:before="140"/>
+      </w:pPr>
+      <w:r>
+        <w:rPr>
+          <w:b/>
+          <w:bCs/>
+          <w:sz w:val="22"/>
+          <w:szCs w:val="22"/>
+        </w:rPr>
+        <w:t xml:space="preserve">4. Sobre el sello del valle del Indo con la figura sentada</w:t>
+      </w:r>
+    </w:p>
+    <w:p>
+      <w:pPr>
+        <w:spacing w:after="60"/>
+        <w:ind w:left="240"/>
+      </w:pPr>
+      <w:r>
+        <w:rPr>
+          <w:b/>
+          <w:bCs/>
+          <w:color w:val="9C4A1A"/>
+          <w:sz w:val="22"/>
+          <w:szCs w:val="22"/>
+        </w:rPr>
+        <w:t xml:space="preserve">Respuesta: </w:t>
+      </w:r>
+      <w:r>
+        <w:rPr>
+          <w:sz w:val="22"/>
+          <w:szCs w:val="22"/>
+        </w:rPr>
+        <w:t xml:space="preserve">Algunos investigadores lo relacionan con formas tempranas de Shiva, pero no está demostrado.</w:t>
+      </w:r>
+    </w:p>
+    <w:p>
+      <w:pPr>
+        <w:spacing w:after="40" w:before="140"/>
+      </w:pPr>
+      <w:r>
+        <w:rPr>
+          <w:b/>
+          <w:bCs/>
+          <w:sz w:val="22"/>
+          <w:szCs w:val="22"/>
+        </w:rPr>
+        <w:t xml:space="preserve">5. ¿Cuál de los cuatro hechos ocurrió primero?</w:t>
+      </w:r>
+    </w:p>
+    <w:p>
+      <w:pPr>
+        <w:spacing w:after="60"/>
+        <w:ind w:left="240"/>
+      </w:pPr>
+      <w:r>
+        <w:rPr>
+          <w:b/>
+          <w:bCs/>
+          <w:color w:val="9C4A1A"/>
+          <w:sz w:val="22"/>
+          <w:szCs w:val="22"/>
+        </w:rPr>
+        <w:t xml:space="preserve">Respuesta: </w:t>
+      </w:r>
+      <w:r>
+        <w:rPr>
+          <w:sz w:val="22"/>
+          <w:szCs w:val="22"/>
+        </w:rPr>
+        <w:t xml:space="preserve">La prohibición legal del sati en Bengala, el 4 de diciembre de 1829.</w:t>
+      </w:r>
+    </w:p>
+    <w:p>
+      <w:pPr>
+        <w:spacing w:before="180"/>
+      </w:pPr>
     </w:p>
     <w:p>
       <w:pPr>
@@ -732,7 +935,7 @@
           <w:sz w:val="22"/>
           <w:szCs w:val="22"/>
         </w:rPr>
-        <w:t xml:space="preserve">Las respuestas correctas son, en orden: la primera opción, la segunda, la tercera, la segunda y la tercera. Están difíciles a propósito: dos se ganan entendiendo un matiz, no memorizando fechas.</w:t>
+        <w:t xml:space="preserve">Las que más se fallan son la 4 y la 5: la 4 se gana admitiendo lo que NO está probado, y la 5 es de orden cronológico. Cada quien ve la explicación en su celular apenas contesta.</w:t>
       </w:r>
     </w:p>
     <w:p>
@@ -913,7 +1116,7 @@
         </w:rPr>
         <w:t xml:space="preserve">Pew Research Center — población hindú en el mundo (2025) — </w:t>
       </w:r>
-      <w:hyperlink w:history="1" r:id="rIddlarzr5pauxra15eno960">
+      <w:hyperlink w:history="1" r:id="rIdgzlp8qp7rwxc-n85wvsgl">
         <w:r>
           <w:rPr>
             <w:rStyle w:val="Hyperlink"/>
@@ -940,7 +1143,7 @@
         </w:rPr>
         <w:t xml:space="preserve">Encyclopædia Britannica — hinduismo — </w:t>
       </w:r>
-      <w:hyperlink w:history="1" r:id="rIdyfy2k353uo9yu-jkk_92t">
+      <w:hyperlink w:history="1" r:id="rIdefo5al4cjnbigwxnqfu-d">
         <w:r>
           <w:rPr>
             <w:rStyle w:val="Hyperlink"/>
@@ -967,7 +1170,7 @@
         </w:rPr>
         <w:t xml:space="preserve">Encyclopædia Britannica — civilización del valle del Indo — </w:t>
       </w:r>
-      <w:hyperlink w:history="1" r:id="rIdsnfjpnerso8l9h9v2jyfp">
+      <w:hyperlink w:history="1" r:id="rIdere01ja9wxf9qo4nkpior">
         <w:r>
           <w:rPr>
             <w:rStyle w:val="Hyperlink"/>
@@ -994,7 +1197,7 @@
         </w:rPr>
         <w:t xml:space="preserve">Encyclopædia Britannica — Upanishads — </w:t>
       </w:r>
-      <w:hyperlink w:history="1" r:id="rIdoivboialr9bdabkmkugas">
+      <w:hyperlink w:history="1" r:id="rIdiwq1eyi1_qu_p5wn39rs-">
         <w:r>
           <w:rPr>
             <w:rStyle w:val="Hyperlink"/>
@@ -1021,7 +1224,7 @@
         </w:rPr>
         <w:t xml:space="preserve">Encyclopædia Britannica — Mahabharata — </w:t>
       </w:r>
-      <w:hyperlink w:history="1" r:id="rIdxbcwhfel7vewb69olyu-h">
+      <w:hyperlink w:history="1" r:id="rIdgz4c-l6hllksag6yip6ou">
         <w:r>
           <w:rPr>
             <w:rStyle w:val="Hyperlink"/>
@@ -1048,7 +1251,7 @@
         </w:rPr>
         <w:t xml:space="preserve">Encyclopædia Britannica — Ramayana — </w:t>
       </w:r>
-      <w:hyperlink w:history="1" r:id="rIdc3jhqon28qta0g6en3j1t">
+      <w:hyperlink w:history="1" r:id="rIdahxa8wo2a8fskh23xngsj">
         <w:r>
           <w:rPr>
             <w:rStyle w:val="Hyperlink"/>
@@ -1075,7 +1278,7 @@
         </w:rPr>
         <w:t xml:space="preserve">ONU — Declaración Universal de Derechos Humanos (arts. 1, 2 y 18) — </w:t>
       </w:r>
-      <w:hyperlink w:history="1" r:id="rIdcord3fhpcl82zb4h9jumk">
+      <w:hyperlink w:history="1" r:id="rIdwb4e4gwtkxee3uoigkoxm">
         <w:r>
           <w:rPr>
             <w:rStyle w:val="Hyperlink"/>
@@ -1102,7 +1305,7 @@
         </w:rPr>
         <w:t xml:space="preserve">Constitución de India — artículo 17, abolición de la intocabilidad — </w:t>
       </w:r>
-      <w:hyperlink w:history="1" r:id="rIdjtwtne_ma9ntxwqsko8ty">
+      <w:hyperlink w:history="1" r:id="rIdgw01rmehel1_n7a2uietz">
         <w:r>
           <w:rPr>
             <w:rStyle w:val="Hyperlink"/>
@@ -1129,7 +1332,7 @@
         </w:rPr>
         <w:t xml:space="preserve">Parlamento de India — datos del NCRB «Crime in India 2023» — </w:t>
       </w:r>
-      <w:hyperlink w:history="1" r:id="rIdogsy0vvoqaiph24e6wdrb">
+      <w:hyperlink w:history="1" r:id="rId5s6mf5ozqpojbqjbsffet">
         <w:r>
           <w:rPr>
             <w:rStyle w:val="Hyperlink"/>
@@ -1156,7 +1359,7 @@
         </w:rPr>
         <w:t xml:space="preserve">Stanford King Institute — viaje de Martin Luther King a India (1959) — </w:t>
       </w:r>
-      <w:hyperlink w:history="1" r:id="rIdpxdwxgedufqhxj4qbrazc">
+      <w:hyperlink w:history="1" r:id="rId06x1rpnd5zh8fti7pcn2p">
         <w:r>
           <w:rPr>
             <w:rStyle w:val="Hyperlink"/>
@@ -1183,7 +1386,7 @@
         </w:rPr>
         <w:t xml:space="preserve">DD News (medio público de India) — cierre del Maha Kumbh 2025 — </w:t>
       </w:r>
-      <w:hyperlink w:history="1" r:id="rIdlu_f4kc9a33mdg_ffk6wj">
+      <w:hyperlink w:history="1" r:id="rIdyljfoewp5kukgtvhqpvqt">
         <w:r>
           <w:rPr>
             <w:rStyle w:val="Hyperlink"/>
@@ -1210,7 +1413,7 @@
         </w:rPr>
         <w:t xml:space="preserve">Britannica — Ram Mandir, Ayodhya — </w:t>
       </w:r>
-      <w:hyperlink w:history="1" r:id="rIdwm7juvc6ntu81brzwjnmn">
+      <w:hyperlink w:history="1" r:id="rIdcynrdml8qfn57layv75qj">
         <w:r>
           <w:rPr>
             <w:rStyle w:val="Hyperlink"/>
@@ -1237,7 +1440,7 @@
         </w:rPr>
         <w:t xml:space="preserve">Belur Math — discursos de Vivekananda en Chicago, 1893 — </w:t>
       </w:r>
-      <w:hyperlink w:history="1" r:id="rIdbc-iwxcbjogm7q22agkfa">
+      <w:hyperlink w:history="1" r:id="rIdnkvb-jmxiakkld8q-vwq9">
         <w:r>
           <w:rPr>
             <w:rStyle w:val="Hyperlink"/>
@@ -1264,7 +1467,7 @@
         </w:rPr>
         <w:t xml:space="preserve">USCIRF — leyes estatales anti-conversión en India — </w:t>
       </w:r>
-      <w:hyperlink w:history="1" r:id="rIdc7zmfjdn20fce6cuhp_k_">
+      <w:hyperlink w:history="1" r:id="rIdfmmets_oufyuy8vac54qf">
         <w:r>
           <w:rPr>
             <w:rStyle w:val="Hyperlink"/>
@@ -1291,7 +1494,7 @@
         </w:rPr>
         <w:t xml:space="preserve">Biblia Reina-Valera Antigua (1909), dominio público — </w:t>
       </w:r>
-      <w:hyperlink w:history="1" r:id="rId3jsovx70b9gfbpnrq39ct">
+      <w:hyperlink w:history="1" r:id="rId1ej-bh-k7l8h2dtxmeasd">
         <w:r>
           <w:rPr>
             <w:rStyle w:val="Hyperlink"/>
@@ -1318,7 +1521,7 @@
         </w:rPr>
         <w:t xml:space="preserve">Wikimedia Commons — origen y licencia de las 22 imágenes — </w:t>
       </w:r>
-      <w:hyperlink w:history="1" r:id="rIdgox5l7qqubgsog-91ai0_">
+      <w:hyperlink w:history="1" r:id="rId0ojooj5vs7-zhz-xpr9rn">
         <w:r>
           <w:rPr>
             <w:rStyle w:val="Hyperlink"/>
@@ -1360,7 +1563,7 @@
         </w:rPr>
         <w:t xml:space="preserve">Se abre desde cualquier celular o computador, sin instalar nada:  </w:t>
       </w:r>
-      <w:hyperlink w:history="1" r:id="rIdf75e-vgso96hqtje3ncgz">
+      <w:hyperlink w:history="1" r:id="rIdlixpimwyga74dx1a605lv">
         <w:r>
           <w:rPr>
             <w:rStyle w:val="Hyperlink"/>

</xml_diff>

<commit_message>
Juan Jose Villa, quiz con nombre y pagina de resultados, sin la escena del cierre biblico
</commit_message>
<xml_diff>
--- a/Guia para exponer - Hinduismo.docx
+++ b/Guia para exponer - Hinduismo.docx
@@ -58,7 +58,7 @@
           <w:sz w:val="21"/>
           <w:szCs w:val="21"/>
         </w:rPr>
-        <w:t xml:space="preserve">Santiago Bolívar · Samuel Villa · Jerónimo Uribe · Dulce María Gómez · Paulina Gómez · Isabel Madrigal</w:t>
+        <w:t xml:space="preserve">Santiago Bolívar · Juan José Villa · Jerónimo Uribe · Dulce María Gómez · Paulina Gómez · Isabel Madrigal</w:t>
       </w:r>
     </w:p>
     <w:p>
@@ -645,54 +645,6 @@
       </w:r>
     </w:p>
     <w:p>
-      <w:pPr>
-        <w:spacing w:after="60"/>
-      </w:pPr>
-    </w:p>
-    <w:p>
-      <w:pPr>
-        <w:pStyle w:val="Heading2"/>
-      </w:pPr>
-      <w:r>
-        <w:t xml:space="preserve">Escena 12 — Lo que creemos nosotros</w:t>
-      </w:r>
-    </w:p>
-    <w:p>
-      <w:pPr>
-        <w:spacing w:after="160" w:line="300"/>
-        <w:jc w:val="both"/>
-      </w:pPr>
-      <w:r>
-        <w:rPr>
-          <w:sz w:val="22"/>
-          <w:szCs w:val="22"/>
-        </w:rPr>
-        <w:t xml:space="preserve">Aquí se marca un cambio explícito de tono, y hay que decirlo en voz alta: «hasta aquí fue la exposición; esto que sigue es lo que creemos nosotros». Se presentan cinco versículos, cada uno con una razón corta. Juan 14:6, donde Jesús no dice que enseña un camino sino que Él es el camino. 1 Timoteo 2:5, que habla de un solo mediador entre Dios y los hombres. Hechos 4:12, que dice que no hay otro nombre por el cual podamos ser salvos. Efesios 2:8-9, que marca la diferencia de fondo con el karma: la salvación no se acumula con obras, se recibe como un regalo. Y Hebreos 9:27, que dice que está establecido que los hombres mueran una sola vez y después venga el juicio, lo cual contrasta directamente con el samsara de la escena 04. Se cierra diciendo que discutimos ideas, nunca personas.</w:t>
-      </w:r>
-    </w:p>
-    <w:p>
-      <w:pPr>
-        <w:spacing w:after="140" w:line="290"/>
-      </w:pPr>
-      <w:r>
-        <w:rPr>
-          <w:b/>
-          <w:bCs/>
-          <w:color w:val="9C4A1A"/>
-          <w:sz w:val="22"/>
-          <w:szCs w:val="22"/>
-        </w:rPr>
-        <w:t xml:space="preserve">Clave:  </w:t>
-      </w:r>
-      <w:r>
-        <w:rPr>
-          <w:sz w:val="22"/>
-          <w:szCs w:val="22"/>
-        </w:rPr>
-        <w:t xml:space="preserve">El contraste más potente es el de Efesios y Hebreos contra karma y samsara, porque conecta directamente con la escena 04. Si conectas eso, la exposición cierra redonda.</w:t>
-      </w:r>
-    </w:p>
-    <w:p>
       <w:r>
         <w:br w:type="page"/>
       </w:r>
@@ -715,7 +667,7 @@
           <w:sz w:val="22"/>
           <w:szCs w:val="22"/>
         </w:rPr>
-        <w:t xml:space="preserve">Después de la escena 12 viene la pantalla del quiz. Ahí solo hay que invitar al curso a sacar el celular, escanear el código QR y responder cinco preguntas. Se abre solo en el navegador, no hay que instalar nada ni tener cuenta de nada. Al terminar, cada uno ve su puntaje y la explicación de cada respuesta. Las cinco preguntas salen de las escenas 02, 03, 04, 07, 08 y 09.</w:t>
+        <w:t xml:space="preserve">Después de la escena 11 viene la pantalla del quiz. Ahí solo hay que invitar al curso a sacar el celular, escanear el código QR y responder cinco preguntas. Se abre solo en el navegador, no hay que instalar nada ni tener cuenta de nada. Al terminar, cada uno ve su puntaje y la explicación de cada respuesta. Las cinco preguntas salen de las escenas 02, 03, 04, 07, 08 y 09.</w:t>
       </w:r>
     </w:p>
     <w:p>
@@ -1116,7 +1068,7 @@
         </w:rPr>
         <w:t xml:space="preserve">Pew Research Center — población hindú en el mundo (2025) — </w:t>
       </w:r>
-      <w:hyperlink w:history="1" r:id="rIdgzlp8qp7rwxc-n85wvsgl">
+      <w:hyperlink w:history="1" r:id="rIdiqgszehmojc87vm6pqgip">
         <w:r>
           <w:rPr>
             <w:rStyle w:val="Hyperlink"/>
@@ -1143,7 +1095,7 @@
         </w:rPr>
         <w:t xml:space="preserve">Encyclopædia Britannica — hinduismo — </w:t>
       </w:r>
-      <w:hyperlink w:history="1" r:id="rIdefo5al4cjnbigwxnqfu-d">
+      <w:hyperlink w:history="1" r:id="rIdlfg6mmgyx7_y8ctev5ogo">
         <w:r>
           <w:rPr>
             <w:rStyle w:val="Hyperlink"/>
@@ -1170,7 +1122,7 @@
         </w:rPr>
         <w:t xml:space="preserve">Encyclopædia Britannica — civilización del valle del Indo — </w:t>
       </w:r>
-      <w:hyperlink w:history="1" r:id="rIdere01ja9wxf9qo4nkpior">
+      <w:hyperlink w:history="1" r:id="rId79eln-v9rfvrcjtwaqbr4">
         <w:r>
           <w:rPr>
             <w:rStyle w:val="Hyperlink"/>
@@ -1197,7 +1149,7 @@
         </w:rPr>
         <w:t xml:space="preserve">Encyclopædia Britannica — Upanishads — </w:t>
       </w:r>
-      <w:hyperlink w:history="1" r:id="rIdiwq1eyi1_qu_p5wn39rs-">
+      <w:hyperlink w:history="1" r:id="rIdy5g_ydvyb1qhvo6dpb-ky">
         <w:r>
           <w:rPr>
             <w:rStyle w:val="Hyperlink"/>
@@ -1224,7 +1176,7 @@
         </w:rPr>
         <w:t xml:space="preserve">Encyclopædia Britannica — Mahabharata — </w:t>
       </w:r>
-      <w:hyperlink w:history="1" r:id="rIdgz4c-l6hllksag6yip6ou">
+      <w:hyperlink w:history="1" r:id="rIdlq_lmwmscotfsf0xoaywb">
         <w:r>
           <w:rPr>
             <w:rStyle w:val="Hyperlink"/>
@@ -1251,7 +1203,7 @@
         </w:rPr>
         <w:t xml:space="preserve">Encyclopædia Britannica — Ramayana — </w:t>
       </w:r>
-      <w:hyperlink w:history="1" r:id="rIdahxa8wo2a8fskh23xngsj">
+      <w:hyperlink w:history="1" r:id="rIdjza2qsj91qj6esabfrnqw">
         <w:r>
           <w:rPr>
             <w:rStyle w:val="Hyperlink"/>
@@ -1278,7 +1230,7 @@
         </w:rPr>
         <w:t xml:space="preserve">ONU — Declaración Universal de Derechos Humanos (arts. 1, 2 y 18) — </w:t>
       </w:r>
-      <w:hyperlink w:history="1" r:id="rIdwb4e4gwtkxee3uoigkoxm">
+      <w:hyperlink w:history="1" r:id="rIdgelqi4hjp9zdf-3mqq44k">
         <w:r>
           <w:rPr>
             <w:rStyle w:val="Hyperlink"/>
@@ -1305,7 +1257,7 @@
         </w:rPr>
         <w:t xml:space="preserve">Constitución de India — artículo 17, abolición de la intocabilidad — </w:t>
       </w:r>
-      <w:hyperlink w:history="1" r:id="rIdgw01rmehel1_n7a2uietz">
+      <w:hyperlink w:history="1" r:id="rId2kktztwko_jpqe2eokbmg">
         <w:r>
           <w:rPr>
             <w:rStyle w:val="Hyperlink"/>
@@ -1332,7 +1284,7 @@
         </w:rPr>
         <w:t xml:space="preserve">Parlamento de India — datos del NCRB «Crime in India 2023» — </w:t>
       </w:r>
-      <w:hyperlink w:history="1" r:id="rId5s6mf5ozqpojbqjbsffet">
+      <w:hyperlink w:history="1" r:id="rIdhhyc64aey-ufm2c8lyvzm">
         <w:r>
           <w:rPr>
             <w:rStyle w:val="Hyperlink"/>
@@ -1359,7 +1311,7 @@
         </w:rPr>
         <w:t xml:space="preserve">Stanford King Institute — viaje de Martin Luther King a India (1959) — </w:t>
       </w:r>
-      <w:hyperlink w:history="1" r:id="rId06x1rpnd5zh8fti7pcn2p">
+      <w:hyperlink w:history="1" r:id="rIdmdn4o-yvpgq5akhjglmgt">
         <w:r>
           <w:rPr>
             <w:rStyle w:val="Hyperlink"/>
@@ -1386,7 +1338,7 @@
         </w:rPr>
         <w:t xml:space="preserve">DD News (medio público de India) — cierre del Maha Kumbh 2025 — </w:t>
       </w:r>
-      <w:hyperlink w:history="1" r:id="rIdyljfoewp5kukgtvhqpvqt">
+      <w:hyperlink w:history="1" r:id="rId0iee4jmrpitzch026ycrn">
         <w:r>
           <w:rPr>
             <w:rStyle w:val="Hyperlink"/>
@@ -1413,7 +1365,7 @@
         </w:rPr>
         <w:t xml:space="preserve">Britannica — Ram Mandir, Ayodhya — </w:t>
       </w:r>
-      <w:hyperlink w:history="1" r:id="rIdcynrdml8qfn57layv75qj">
+      <w:hyperlink w:history="1" r:id="rIdcrxwqvubdke7njldqywy9">
         <w:r>
           <w:rPr>
             <w:rStyle w:val="Hyperlink"/>
@@ -1440,7 +1392,7 @@
         </w:rPr>
         <w:t xml:space="preserve">Belur Math — discursos de Vivekananda en Chicago, 1893 — </w:t>
       </w:r>
-      <w:hyperlink w:history="1" r:id="rIdnkvb-jmxiakkld8q-vwq9">
+      <w:hyperlink w:history="1" r:id="rIdfzfphy1se4o9wmnflwonj">
         <w:r>
           <w:rPr>
             <w:rStyle w:val="Hyperlink"/>
@@ -1467,7 +1419,7 @@
         </w:rPr>
         <w:t xml:space="preserve">USCIRF — leyes estatales anti-conversión en India — </w:t>
       </w:r>
-      <w:hyperlink w:history="1" r:id="rIdfmmets_oufyuy8vac54qf">
+      <w:hyperlink w:history="1" r:id="rIdauecpmb0ktsu1jgvvazr1">
         <w:r>
           <w:rPr>
             <w:rStyle w:val="Hyperlink"/>
@@ -1494,7 +1446,7 @@
         </w:rPr>
         <w:t xml:space="preserve">Biblia Reina-Valera Antigua (1909), dominio público — </w:t>
       </w:r>
-      <w:hyperlink w:history="1" r:id="rId1ej-bh-k7l8h2dtxmeasd">
+      <w:hyperlink w:history="1" r:id="rIdua2pj7gp1drs7occwdips">
         <w:r>
           <w:rPr>
             <w:rStyle w:val="Hyperlink"/>
@@ -1521,7 +1473,7 @@
         </w:rPr>
         <w:t xml:space="preserve">Wikimedia Commons — origen y licencia de las 22 imágenes — </w:t>
       </w:r>
-      <w:hyperlink w:history="1" r:id="rId0ojooj5vs7-zhz-xpr9rn">
+      <w:hyperlink w:history="1" r:id="rIdosn23sc1spi14yoqe255f">
         <w:r>
           <w:rPr>
             <w:rStyle w:val="Hyperlink"/>
@@ -1554,6 +1506,30 @@
     </w:p>
     <w:p>
       <w:pPr>
+        <w:spacing w:after="140"/>
+      </w:pPr>
+      <w:r>
+        <w:rPr>
+          <w:sz w:val="22"/>
+          <w:szCs w:val="22"/>
+        </w:rPr>
+        <w:t xml:space="preserve">Resultados del quiz (quién respondió y cuánto sacó):  </w:t>
+      </w:r>
+      <w:hyperlink w:history="1" r:id="rIdxwjwqr5spuil7q2_5usdw">
+        <w:r>
+          <w:rPr>
+            <w:rStyle w:val="Hyperlink"/>
+            <w:b/>
+            <w:bCs/>
+            <w:sz w:val="22"/>
+            <w:szCs w:val="22"/>
+          </w:rPr>
+          <w:t xml:space="preserve">jeronimoouribe.github.io/expo-hinduismo/resultados.html</w:t>
+        </w:r>
+      </w:hyperlink>
+    </w:p>
+    <w:p>
+      <w:pPr>
         <w:spacing w:after="300"/>
       </w:pPr>
       <w:r>
@@ -1563,7 +1539,7 @@
         </w:rPr>
         <w:t xml:space="preserve">Se abre desde cualquier celular o computador, sin instalar nada:  </w:t>
       </w:r>
-      <w:hyperlink w:history="1" r:id="rIdlixpimwyga74dx1a605lv">
+      <w:hyperlink w:history="1" r:id="rIdrkgwtcqqfpv4gyu4qfhbq">
         <w:r>
           <w:rPr>
             <w:rStyle w:val="Hyperlink"/>

</xml_diff>